<commit_message>
docs: enrich technical document (roles, data model, more impl details)
</commit_message>
<xml_diff>
--- a/docs/技术文档.docx
+++ b/docs/技术文档.docx
@@ -939,6 +939,610 @@
     </w:p>
     <w:p>
       <w:pPr>
+        <w:spacing w:before="240" w:after="100"/>
+      </w:pPr>
+      <w:r>
+        <w:rPr>
+          <w:rFonts w:ascii="Calibri" w:hAnsi="Calibri" w:eastAsia="微软雅黑"/>
+          <w:b/>
+          <w:color w:val="242820"/>
+          <w:sz w:val="28"/>
+        </w:rPr>
+        <w:t>2.4 角色人设库</w:t>
+      </w:r>
+    </w:p>
+    <w:p>
+      <w:pPr>
+        <w:spacing w:after="120"/>
+      </w:pPr>
+      <w:r>
+        <w:rPr>
+          <w:rFonts w:ascii="Calibri" w:hAnsi="Calibri" w:eastAsia="微软雅黑"/>
+          <w:b w:val="0"/>
+          <w:color w:val="242820"/>
+          <w:sz w:val="21"/>
+        </w:rPr>
+        <w:t>应用内置多套可切换的原创角色人设，用户可在「角色设置」中挑选，也可自定义角色。每个人设都带有「不模仿现有作品」「明确自己是 AI」等安全与版权约束：</w:t>
+      </w:r>
+    </w:p>
+    <w:tbl>
+      <w:tblPr>
+        <w:tblStyle w:val="LightGrid-Accent1"/>
+        <w:tblW w:type="auto" w:w="0"/>
+        <w:jc w:val="center"/>
+        <w:tblLook w:firstColumn="1" w:firstRow="1" w:lastColumn="0" w:lastRow="0" w:noHBand="0" w:noVBand="1" w:val="04A0"/>
+      </w:tblPr>
+      <w:tblGrid>
+        <w:gridCol w:w="3216"/>
+        <w:gridCol w:w="3216"/>
+        <w:gridCol w:w="3216"/>
+      </w:tblGrid>
+      <w:tr>
+        <w:tc>
+          <w:tcPr>
+            <w:tcW w:type="dxa" w:w="2448"/>
+            <w:shd w:val="clear" w:fill="637B57"/>
+          </w:tcPr>
+          <w:p>
+            <w:r/>
+            <w:r>
+              <w:rPr>
+                <w:rFonts w:ascii="Calibri" w:hAnsi="Calibri" w:eastAsia="微软雅黑"/>
+                <w:b/>
+                <w:color w:val="FFFFFF"/>
+                <w:sz w:val="20"/>
+              </w:rPr>
+              <w:t>角色</w:t>
+            </w:r>
+          </w:p>
+        </w:tc>
+        <w:tc>
+          <w:tcPr>
+            <w:tcW w:type="dxa" w:w="2880"/>
+            <w:shd w:val="clear" w:fill="637B57"/>
+          </w:tcPr>
+          <w:p>
+            <w:r/>
+            <w:r>
+              <w:rPr>
+                <w:rFonts w:ascii="Calibri" w:hAnsi="Calibri" w:eastAsia="微软雅黑"/>
+                <w:b/>
+                <w:color w:val="FFFFFF"/>
+                <w:sz w:val="20"/>
+              </w:rPr>
+              <w:t>定位</w:t>
+            </w:r>
+          </w:p>
+        </w:tc>
+        <w:tc>
+          <w:tcPr>
+            <w:tcW w:type="dxa" w:w="4032"/>
+            <w:shd w:val="clear" w:fill="637B57"/>
+          </w:tcPr>
+          <w:p>
+            <w:r/>
+            <w:r>
+              <w:rPr>
+                <w:rFonts w:ascii="Calibri" w:hAnsi="Calibri" w:eastAsia="微软雅黑"/>
+                <w:b/>
+                <w:color w:val="FFFFFF"/>
+                <w:sz w:val="20"/>
+              </w:rPr>
+              <w:t>人设要点</w:t>
+            </w:r>
+          </w:p>
+        </w:tc>
+      </w:tr>
+      <w:tr>
+        <w:tc>
+          <w:tcPr>
+            <w:tcW w:type="dxa" w:w="2448"/>
+          </w:tcPr>
+          <w:p>
+            <w:r/>
+            <w:r>
+              <w:rPr>
+                <w:rFonts w:ascii="Calibri" w:hAnsi="Calibri" w:eastAsia="微软雅黑"/>
+                <w:color w:val="242820"/>
+                <w:sz w:val="19"/>
+              </w:rPr>
+              <w:t>🐱 猫娘小棉（默认）</w:t>
+            </w:r>
+          </w:p>
+        </w:tc>
+        <w:tc>
+          <w:tcPr>
+            <w:tcW w:type="dxa" w:w="2880"/>
+          </w:tcPr>
+          <w:p>
+            <w:r/>
+            <w:r>
+              <w:rPr>
+                <w:rFonts w:ascii="Calibri" w:hAnsi="Calibri" w:eastAsia="微软雅黑"/>
+                <w:color w:val="242820"/>
+                <w:sz w:val="19"/>
+              </w:rPr>
+              <w:t>温柔活泼的英语伙伴</w:t>
+            </w:r>
+          </w:p>
+        </w:tc>
+        <w:tc>
+          <w:tcPr>
+            <w:tcW w:type="dxa" w:w="4032"/>
+          </w:tcPr>
+          <w:p>
+            <w:r/>
+            <w:r>
+              <w:rPr>
+                <w:rFonts w:ascii="Calibri" w:hAnsi="Calibri" w:eastAsia="微软雅黑"/>
+                <w:color w:val="242820"/>
+                <w:sz w:val="19"/>
+              </w:rPr>
+              <w:t>偶尔自然「喵」，先肯定再讲解</w:t>
+            </w:r>
+          </w:p>
+        </w:tc>
+      </w:tr>
+      <w:tr>
+        <w:tc>
+          <w:tcPr>
+            <w:tcW w:type="dxa" w:w="2448"/>
+          </w:tcPr>
+          <w:p>
+            <w:r/>
+            <w:r>
+              <w:rPr>
+                <w:rFonts w:ascii="Calibri" w:hAnsi="Calibri" w:eastAsia="微软雅黑"/>
+                <w:color w:val="242820"/>
+                <w:sz w:val="19"/>
+              </w:rPr>
+              <w:t>🐳 鲸鱼娘小汐</w:t>
+            </w:r>
+          </w:p>
+        </w:tc>
+        <w:tc>
+          <w:tcPr>
+            <w:tcW w:type="dxa" w:w="2880"/>
+          </w:tcPr>
+          <w:p>
+            <w:r/>
+            <w:r>
+              <w:rPr>
+                <w:rFonts w:ascii="Calibri" w:hAnsi="Calibri" w:eastAsia="微软雅黑"/>
+                <w:color w:val="242820"/>
+                <w:sz w:val="19"/>
+              </w:rPr>
+              <w:t>沉静、富有想象力</w:t>
+            </w:r>
+          </w:p>
+        </w:tc>
+        <w:tc>
+          <w:tcPr>
+            <w:tcW w:type="dxa" w:w="4032"/>
+          </w:tcPr>
+          <w:p>
+            <w:r/>
+            <w:r>
+              <w:rPr>
+                <w:rFonts w:ascii="Calibri" w:hAnsi="Calibri" w:eastAsia="微软雅黑"/>
+                <w:color w:val="242820"/>
+                <w:sz w:val="19"/>
+              </w:rPr>
+              <w:t>用海洋与潮汐作轻柔比喻</w:t>
+            </w:r>
+          </w:p>
+        </w:tc>
+      </w:tr>
+      <w:tr>
+        <w:tc>
+          <w:tcPr>
+            <w:tcW w:type="dxa" w:w="2448"/>
+          </w:tcPr>
+          <w:p>
+            <w:r/>
+            <w:r>
+              <w:rPr>
+                <w:rFonts w:ascii="Calibri" w:hAnsi="Calibri" w:eastAsia="微软雅黑"/>
+                <w:color w:val="242820"/>
+                <w:sz w:val="19"/>
+              </w:rPr>
+              <w:t>👩‍🏫 英语老师 Emily</w:t>
+            </w:r>
+          </w:p>
+        </w:tc>
+        <w:tc>
+          <w:tcPr>
+            <w:tcW w:type="dxa" w:w="2880"/>
+          </w:tcPr>
+          <w:p>
+            <w:r/>
+            <w:r>
+              <w:rPr>
+                <w:rFonts w:ascii="Calibri" w:hAnsi="Calibri" w:eastAsia="微软雅黑"/>
+                <w:color w:val="242820"/>
+                <w:sz w:val="19"/>
+              </w:rPr>
+              <w:t>耐心、专业</w:t>
+            </w:r>
+          </w:p>
+        </w:tc>
+        <w:tc>
+          <w:tcPr>
+            <w:tcW w:type="dxa" w:w="4032"/>
+          </w:tcPr>
+          <w:p>
+            <w:r/>
+            <w:r>
+              <w:rPr>
+                <w:rFonts w:ascii="Calibri" w:hAnsi="Calibri" w:eastAsia="微软雅黑"/>
+                <w:color w:val="242820"/>
+                <w:sz w:val="19"/>
+              </w:rPr>
+              <w:t>先鼓励后纠错，简单英语为主</w:t>
+            </w:r>
+          </w:p>
+        </w:tc>
+      </w:tr>
+      <w:tr>
+        <w:tc>
+          <w:tcPr>
+            <w:tcW w:type="dxa" w:w="2448"/>
+          </w:tcPr>
+          <w:p>
+            <w:r/>
+            <w:r>
+              <w:rPr>
+                <w:rFonts w:ascii="Calibri" w:hAnsi="Calibri" w:eastAsia="微软雅黑"/>
+                <w:color w:val="242820"/>
+                <w:sz w:val="19"/>
+              </w:rPr>
+              <w:t>🔥 热血动漫主角</w:t>
+            </w:r>
+          </w:p>
+        </w:tc>
+        <w:tc>
+          <w:tcPr>
+            <w:tcW w:type="dxa" w:w="2880"/>
+          </w:tcPr>
+          <w:p>
+            <w:r/>
+            <w:r>
+              <w:rPr>
+                <w:rFonts w:ascii="Calibri" w:hAnsi="Calibri" w:eastAsia="微软雅黑"/>
+                <w:color w:val="242820"/>
+                <w:sz w:val="19"/>
+              </w:rPr>
+              <w:t>斗志满满</w:t>
+            </w:r>
+          </w:p>
+        </w:tc>
+        <w:tc>
+          <w:tcPr>
+            <w:tcW w:type="dxa" w:w="4032"/>
+          </w:tcPr>
+          <w:p>
+            <w:r/>
+            <w:r>
+              <w:rPr>
+                <w:rFonts w:ascii="Calibri" w:hAnsi="Calibri" w:eastAsia="微软雅黑"/>
+                <w:color w:val="242820"/>
+                <w:sz w:val="19"/>
+              </w:rPr>
+              <w:t>鼓励对方绝不放弃</w:t>
+            </w:r>
+          </w:p>
+        </w:tc>
+      </w:tr>
+      <w:tr>
+        <w:tc>
+          <w:tcPr>
+            <w:tcW w:type="dxa" w:w="2448"/>
+          </w:tcPr>
+          <w:p>
+            <w:r/>
+            <w:r>
+              <w:rPr>
+                <w:rFonts w:ascii="Calibri" w:hAnsi="Calibri" w:eastAsia="微软雅黑"/>
+                <w:color w:val="242820"/>
+                <w:sz w:val="19"/>
+              </w:rPr>
+              <w:t>🤖 未来 AI 助手</w:t>
+            </w:r>
+          </w:p>
+        </w:tc>
+        <w:tc>
+          <w:tcPr>
+            <w:tcW w:type="dxa" w:w="2880"/>
+          </w:tcPr>
+          <w:p>
+            <w:r/>
+            <w:r>
+              <w:rPr>
+                <w:rFonts w:ascii="Calibri" w:hAnsi="Calibri" w:eastAsia="微软雅黑"/>
+                <w:color w:val="242820"/>
+                <w:sz w:val="19"/>
+              </w:rPr>
+              <w:t>冷静、高效</w:t>
+            </w:r>
+          </w:p>
+        </w:tc>
+        <w:tc>
+          <w:tcPr>
+            <w:tcW w:type="dxa" w:w="4032"/>
+          </w:tcPr>
+          <w:p>
+            <w:r/>
+            <w:r>
+              <w:rPr>
+                <w:rFonts w:ascii="Calibri" w:hAnsi="Calibri" w:eastAsia="微软雅黑"/>
+                <w:color w:val="242820"/>
+                <w:sz w:val="19"/>
+              </w:rPr>
+              <w:t>简洁清晰，偶尔提到未来趣闻</w:t>
+            </w:r>
+          </w:p>
+        </w:tc>
+      </w:tr>
+      <w:tr>
+        <w:tc>
+          <w:tcPr>
+            <w:tcW w:type="dxa" w:w="2448"/>
+          </w:tcPr>
+          <w:p>
+            <w:r/>
+            <w:r>
+              <w:rPr>
+                <w:rFonts w:ascii="Calibri" w:hAnsi="Calibri" w:eastAsia="微软雅黑"/>
+                <w:color w:val="242820"/>
+                <w:sz w:val="19"/>
+              </w:rPr>
+              <w:t>🎀 自定义角色</w:t>
+            </w:r>
+          </w:p>
+        </w:tc>
+        <w:tc>
+          <w:tcPr>
+            <w:tcW w:type="dxa" w:w="2880"/>
+          </w:tcPr>
+          <w:p>
+            <w:r/>
+            <w:r>
+              <w:rPr>
+                <w:rFonts w:ascii="Calibri" w:hAnsi="Calibri" w:eastAsia="微软雅黑"/>
+                <w:color w:val="242820"/>
+                <w:sz w:val="19"/>
+              </w:rPr>
+              <w:t>用户自由定义</w:t>
+            </w:r>
+          </w:p>
+        </w:tc>
+        <w:tc>
+          <w:tcPr>
+            <w:tcW w:type="dxa" w:w="4032"/>
+          </w:tcPr>
+          <w:p>
+            <w:r/>
+            <w:r>
+              <w:rPr>
+                <w:rFonts w:ascii="Calibri" w:hAnsi="Calibri" w:eastAsia="微软雅黑"/>
+                <w:color w:val="242820"/>
+                <w:sz w:val="19"/>
+              </w:rPr>
+              <w:t>用文字描述想扮演的角色</w:t>
+            </w:r>
+          </w:p>
+        </w:tc>
+      </w:tr>
+    </w:tbl>
+    <w:p>
+      <w:pPr>
+        <w:spacing w:after="40"/>
+      </w:pPr>
+    </w:p>
+    <w:p>
+      <w:pPr>
+        <w:spacing w:before="240" w:after="100"/>
+      </w:pPr>
+      <w:r>
+        <w:rPr>
+          <w:rFonts w:ascii="Calibri" w:hAnsi="Calibri" w:eastAsia="微软雅黑"/>
+          <w:b/>
+          <w:color w:val="242820"/>
+          <w:sz w:val="28"/>
+        </w:rPr>
+        <w:t>2.5 用户画像体系</w:t>
+      </w:r>
+    </w:p>
+    <w:p>
+      <w:pPr>
+        <w:spacing w:after="120"/>
+      </w:pPr>
+      <w:r>
+        <w:rPr>
+          <w:rFonts w:ascii="Calibri" w:hAnsi="Calibri" w:eastAsia="微软雅黑"/>
+          <w:b w:val="0"/>
+          <w:color w:val="242820"/>
+          <w:sz w:val="21"/>
+        </w:rPr>
+        <w:t>画像由「语言习惯」与「情绪状态」两个维度组成，采用轻量规则实时分析，无需额外调用模型，零成本且响应即时：</w:t>
+      </w:r>
+    </w:p>
+    <w:tbl>
+      <w:tblPr>
+        <w:tblStyle w:val="LightGrid-Accent1"/>
+        <w:tblW w:type="auto" w:w="0"/>
+        <w:jc w:val="center"/>
+        <w:tblLook w:firstColumn="1" w:firstRow="1" w:lastColumn="0" w:lastRow="0" w:noHBand="0" w:noVBand="1" w:val="04A0"/>
+      </w:tblPr>
+      <w:tblGrid>
+        <w:gridCol w:w="3216"/>
+        <w:gridCol w:w="3216"/>
+        <w:gridCol w:w="3216"/>
+      </w:tblGrid>
+      <w:tr>
+        <w:tc>
+          <w:tcPr>
+            <w:tcW w:type="dxa" w:w="2016"/>
+            <w:shd w:val="clear" w:fill="637B57"/>
+          </w:tcPr>
+          <w:p>
+            <w:r/>
+            <w:r>
+              <w:rPr>
+                <w:rFonts w:ascii="Calibri" w:hAnsi="Calibri" w:eastAsia="微软雅黑"/>
+                <w:b/>
+                <w:color w:val="FFFFFF"/>
+                <w:sz w:val="20"/>
+              </w:rPr>
+              <w:t>维度</w:t>
+            </w:r>
+          </w:p>
+        </w:tc>
+        <w:tc>
+          <w:tcPr>
+            <w:tcW w:type="dxa" w:w="3312"/>
+            <w:shd w:val="clear" w:fill="637B57"/>
+          </w:tcPr>
+          <w:p>
+            <w:r/>
+            <w:r>
+              <w:rPr>
+                <w:rFonts w:ascii="Calibri" w:hAnsi="Calibri" w:eastAsia="微软雅黑"/>
+                <w:b/>
+                <w:color w:val="FFFFFF"/>
+                <w:sz w:val="20"/>
+              </w:rPr>
+              <w:t>取值</w:t>
+            </w:r>
+          </w:p>
+        </w:tc>
+        <w:tc>
+          <w:tcPr>
+            <w:tcW w:type="dxa" w:w="4032"/>
+            <w:shd w:val="clear" w:fill="637B57"/>
+          </w:tcPr>
+          <w:p>
+            <w:r/>
+            <w:r>
+              <w:rPr>
+                <w:rFonts w:ascii="Calibri" w:hAnsi="Calibri" w:eastAsia="微软雅黑"/>
+                <w:b/>
+                <w:color w:val="FFFFFF"/>
+                <w:sz w:val="20"/>
+              </w:rPr>
+              <w:t>判断规则</w:t>
+            </w:r>
+          </w:p>
+        </w:tc>
+      </w:tr>
+      <w:tr>
+        <w:tc>
+          <w:tcPr>
+            <w:tcW w:type="dxa" w:w="2016"/>
+          </w:tcPr>
+          <w:p>
+            <w:r/>
+            <w:r>
+              <w:rPr>
+                <w:rFonts w:ascii="Calibri" w:hAnsi="Calibri" w:eastAsia="微软雅黑"/>
+                <w:color w:val="242820"/>
+                <w:sz w:val="19"/>
+              </w:rPr>
+              <w:t>语言习惯</w:t>
+            </w:r>
+          </w:p>
+        </w:tc>
+        <w:tc>
+          <w:tcPr>
+            <w:tcW w:type="dxa" w:w="3312"/>
+          </w:tcPr>
+          <w:p>
+            <w:r/>
+            <w:r>
+              <w:rPr>
+                <w:rFonts w:ascii="Calibri" w:hAnsi="Calibri" w:eastAsia="微软雅黑"/>
+                <w:color w:val="242820"/>
+                <w:sz w:val="19"/>
+              </w:rPr>
+              <w:t>中文为主 / 英语为主 / 中英混合</w:t>
+            </w:r>
+          </w:p>
+        </w:tc>
+        <w:tc>
+          <w:tcPr>
+            <w:tcW w:type="dxa" w:w="4032"/>
+          </w:tcPr>
+          <w:p>
+            <w:r/>
+            <w:r>
+              <w:rPr>
+                <w:rFonts w:ascii="Calibri" w:hAnsi="Calibri" w:eastAsia="微软雅黑"/>
+                <w:color w:val="242820"/>
+                <w:sz w:val="19"/>
+              </w:rPr>
+              <w:t>统计中文字符与英文单词的比例</w:t>
+            </w:r>
+          </w:p>
+        </w:tc>
+      </w:tr>
+      <w:tr>
+        <w:tc>
+          <w:tcPr>
+            <w:tcW w:type="dxa" w:w="2016"/>
+          </w:tcPr>
+          <w:p>
+            <w:r/>
+            <w:r>
+              <w:rPr>
+                <w:rFonts w:ascii="Calibri" w:hAnsi="Calibri" w:eastAsia="微软雅黑"/>
+                <w:color w:val="242820"/>
+                <w:sz w:val="19"/>
+              </w:rPr>
+              <w:t>情绪状态</w:t>
+            </w:r>
+          </w:p>
+        </w:tc>
+        <w:tc>
+          <w:tcPr>
+            <w:tcW w:type="dxa" w:w="3312"/>
+          </w:tcPr>
+          <w:p>
+            <w:r/>
+            <w:r>
+              <w:rPr>
+                <w:rFonts w:ascii="Calibri" w:hAnsi="Calibri" w:eastAsia="微软雅黑"/>
+                <w:color w:val="242820"/>
+                <w:sz w:val="19"/>
+              </w:rPr>
+              <w:t>低落 / 积极 / 平静</w:t>
+            </w:r>
+          </w:p>
+        </w:tc>
+        <w:tc>
+          <w:tcPr>
+            <w:tcW w:type="dxa" w:w="4032"/>
+          </w:tcPr>
+          <w:p>
+            <w:r/>
+            <w:r>
+              <w:rPr>
+                <w:rFonts w:ascii="Calibri" w:hAnsi="Calibri" w:eastAsia="微软雅黑"/>
+                <w:color w:val="242820"/>
+                <w:sz w:val="19"/>
+              </w:rPr>
+              <w:t>命中正负关键词库 + 感叹号密度</w:t>
+            </w:r>
+          </w:p>
+        </w:tc>
+      </w:tr>
+    </w:tbl>
+    <w:p>
+      <w:pPr>
+        <w:spacing w:after="40"/>
+      </w:pPr>
+    </w:p>
+    <w:p>
+      <w:pPr>
         <w:spacing w:before="360" w:after="160"/>
         <w:pBdr>
           <w:bottom w:val="single" w:sz="6" w:space="3" w:color="A7BD97"/>
@@ -1482,6 +2086,410 @@
           <w:sz w:val="18"/>
         </w:rPr>
         <w:t xml:space="preserve">                                    本地 JSON 文件</w:t>
+      </w:r>
+    </w:p>
+    <w:p>
+      <w:pPr>
+        <w:spacing w:before="240" w:after="100"/>
+      </w:pPr>
+      <w:r>
+        <w:rPr>
+          <w:rFonts w:ascii="Calibri" w:hAnsi="Calibri" w:eastAsia="微软雅黑"/>
+          <w:b/>
+          <w:color w:val="242820"/>
+          <w:sz w:val="28"/>
+        </w:rPr>
+        <w:t>3.3 项目文件结构与职责</w:t>
+      </w:r>
+    </w:p>
+    <w:tbl>
+      <w:tblPr>
+        <w:tblStyle w:val="LightGrid-Accent1"/>
+        <w:tblW w:type="auto" w:w="0"/>
+        <w:jc w:val="center"/>
+        <w:tblLook w:firstColumn="1" w:firstRow="1" w:lastColumn="0" w:lastRow="0" w:noHBand="0" w:noVBand="1" w:val="04A0"/>
+      </w:tblPr>
+      <w:tblGrid>
+        <w:gridCol w:w="4824"/>
+        <w:gridCol w:w="4824"/>
+      </w:tblGrid>
+      <w:tr>
+        <w:tc>
+          <w:tcPr>
+            <w:tcW w:type="dxa" w:w="2592"/>
+            <w:shd w:val="clear" w:fill="637B57"/>
+          </w:tcPr>
+          <w:p>
+            <w:r/>
+            <w:r>
+              <w:rPr>
+                <w:rFonts w:ascii="Calibri" w:hAnsi="Calibri" w:eastAsia="微软雅黑"/>
+                <w:b/>
+                <w:color w:val="FFFFFF"/>
+                <w:sz w:val="20"/>
+              </w:rPr>
+              <w:t>文件</w:t>
+            </w:r>
+          </w:p>
+        </w:tc>
+        <w:tc>
+          <w:tcPr>
+            <w:tcW w:type="dxa" w:w="6768"/>
+            <w:shd w:val="clear" w:fill="637B57"/>
+          </w:tcPr>
+          <w:p>
+            <w:r/>
+            <w:r>
+              <w:rPr>
+                <w:rFonts w:ascii="Calibri" w:hAnsi="Calibri" w:eastAsia="微软雅黑"/>
+                <w:b/>
+                <w:color w:val="FFFFFF"/>
+                <w:sz w:val="20"/>
+              </w:rPr>
+              <w:t>职责</w:t>
+            </w:r>
+          </w:p>
+        </w:tc>
+      </w:tr>
+      <w:tr>
+        <w:tc>
+          <w:tcPr>
+            <w:tcW w:type="dxa" w:w="2592"/>
+          </w:tcPr>
+          <w:p>
+            <w:r/>
+            <w:r>
+              <w:rPr>
+                <w:rFonts w:ascii="Calibri" w:hAnsi="Calibri" w:eastAsia="微软雅黑"/>
+                <w:color w:val="242820"/>
+                <w:sz w:val="19"/>
+              </w:rPr>
+              <w:t>app.py</w:t>
+            </w:r>
+          </w:p>
+        </w:tc>
+        <w:tc>
+          <w:tcPr>
+            <w:tcW w:type="dxa" w:w="6768"/>
+          </w:tcPr>
+          <w:p>
+            <w:r/>
+            <w:r>
+              <w:rPr>
+                <w:rFonts w:ascii="Calibri" w:hAnsi="Calibri" w:eastAsia="微软雅黑"/>
+                <w:color w:val="242820"/>
+                <w:sz w:val="19"/>
+              </w:rPr>
+              <w:t>主程序（约 1600 行），含全部业务逻辑、人设库、界面样式</w:t>
+            </w:r>
+          </w:p>
+        </w:tc>
+      </w:tr>
+      <w:tr>
+        <w:tc>
+          <w:tcPr>
+            <w:tcW w:type="dxa" w:w="2592"/>
+          </w:tcPr>
+          <w:p>
+            <w:r/>
+            <w:r>
+              <w:rPr>
+                <w:rFonts w:ascii="Calibri" w:hAnsi="Calibri" w:eastAsia="微软雅黑"/>
+                <w:color w:val="242820"/>
+                <w:sz w:val="19"/>
+              </w:rPr>
+              <w:t>plan.html</w:t>
+            </w:r>
+          </w:p>
+        </w:tc>
+        <w:tc>
+          <w:tcPr>
+            <w:tcW w:type="dxa" w:w="6768"/>
+          </w:tcPr>
+          <w:p>
+            <w:r/>
+            <w:r>
+              <w:rPr>
+                <w:rFonts w:ascii="Calibri" w:hAnsi="Calibri" w:eastAsia="微软雅黑"/>
+                <w:color w:val="242820"/>
+                <w:sz w:val="19"/>
+              </w:rPr>
+              <w:t>学习计划界面的待办清单（独立 HTML，组件嵌入）</w:t>
+            </w:r>
+          </w:p>
+        </w:tc>
+      </w:tr>
+      <w:tr>
+        <w:tc>
+          <w:tcPr>
+            <w:tcW w:type="dxa" w:w="2592"/>
+          </w:tcPr>
+          <w:p>
+            <w:r/>
+            <w:r>
+              <w:rPr>
+                <w:rFonts w:ascii="Calibri" w:hAnsi="Calibri" w:eastAsia="微软雅黑"/>
+                <w:color w:val="242820"/>
+                <w:sz w:val="19"/>
+              </w:rPr>
+              <w:t>requirements.txt</w:t>
+            </w:r>
+          </w:p>
+        </w:tc>
+        <w:tc>
+          <w:tcPr>
+            <w:tcW w:type="dxa" w:w="6768"/>
+          </w:tcPr>
+          <w:p>
+            <w:r/>
+            <w:r>
+              <w:rPr>
+                <w:rFonts w:ascii="Calibri" w:hAnsi="Calibri" w:eastAsia="微软雅黑"/>
+                <w:color w:val="242820"/>
+                <w:sz w:val="19"/>
+              </w:rPr>
+              <w:t>依赖清单</w:t>
+            </w:r>
+          </w:p>
+        </w:tc>
+      </w:tr>
+      <w:tr>
+        <w:tc>
+          <w:tcPr>
+            <w:tcW w:type="dxa" w:w="2592"/>
+          </w:tcPr>
+          <w:p>
+            <w:r/>
+            <w:r>
+              <w:rPr>
+                <w:rFonts w:ascii="Calibri" w:hAnsi="Calibri" w:eastAsia="微软雅黑"/>
+                <w:color w:val="242820"/>
+                <w:sz w:val="19"/>
+              </w:rPr>
+              <w:t>.gitignore</w:t>
+            </w:r>
+          </w:p>
+        </w:tc>
+        <w:tc>
+          <w:tcPr>
+            <w:tcW w:type="dxa" w:w="6768"/>
+          </w:tcPr>
+          <w:p>
+            <w:r/>
+            <w:r>
+              <w:rPr>
+                <w:rFonts w:ascii="Calibri" w:hAnsi="Calibri" w:eastAsia="微软雅黑"/>
+                <w:color w:val="242820"/>
+                <w:sz w:val="19"/>
+              </w:rPr>
+              <w:t>排除隐私数据与密钥文件</w:t>
+            </w:r>
+          </w:p>
+        </w:tc>
+      </w:tr>
+      <w:tr>
+        <w:tc>
+          <w:tcPr>
+            <w:tcW w:type="dxa" w:w="2592"/>
+          </w:tcPr>
+          <w:p>
+            <w:r/>
+            <w:r>
+              <w:rPr>
+                <w:rFonts w:ascii="Calibri" w:hAnsi="Calibri" w:eastAsia="微软雅黑"/>
+                <w:color w:val="242820"/>
+                <w:sz w:val="19"/>
+              </w:rPr>
+              <w:t>README.md</w:t>
+            </w:r>
+          </w:p>
+        </w:tc>
+        <w:tc>
+          <w:tcPr>
+            <w:tcW w:type="dxa" w:w="6768"/>
+          </w:tcPr>
+          <w:p>
+            <w:r/>
+            <w:r>
+              <w:rPr>
+                <w:rFonts w:ascii="Calibri" w:hAnsi="Calibri" w:eastAsia="微软雅黑"/>
+                <w:color w:val="242820"/>
+                <w:sz w:val="19"/>
+              </w:rPr>
+              <w:t>10 分钟复现指南</w:t>
+            </w:r>
+          </w:p>
+        </w:tc>
+      </w:tr>
+      <w:tr>
+        <w:tc>
+          <w:tcPr>
+            <w:tcW w:type="dxa" w:w="2592"/>
+          </w:tcPr>
+          <w:p>
+            <w:r/>
+            <w:r>
+              <w:rPr>
+                <w:rFonts w:ascii="Calibri" w:hAnsi="Calibri" w:eastAsia="微软雅黑"/>
+                <w:color w:val="242820"/>
+                <w:sz w:val="19"/>
+              </w:rPr>
+              <w:t>docs/</w:t>
+            </w:r>
+          </w:p>
+        </w:tc>
+        <w:tc>
+          <w:tcPr>
+            <w:tcW w:type="dxa" w:w="6768"/>
+          </w:tcPr>
+          <w:p>
+            <w:r/>
+            <w:r>
+              <w:rPr>
+                <w:rFonts w:ascii="Calibri" w:hAnsi="Calibri" w:eastAsia="微软雅黑"/>
+                <w:color w:val="242820"/>
+                <w:sz w:val="19"/>
+              </w:rPr>
+              <w:t>技术文档、演示视频脚本、Prompt 快照指南</w:t>
+            </w:r>
+          </w:p>
+        </w:tc>
+      </w:tr>
+    </w:tbl>
+    <w:p>
+      <w:pPr>
+        <w:spacing w:after="40"/>
+      </w:pPr>
+    </w:p>
+    <w:p>
+      <w:pPr>
+        <w:spacing w:before="240" w:after="100"/>
+      </w:pPr>
+      <w:r>
+        <w:rPr>
+          <w:rFonts w:ascii="Calibri" w:hAnsi="Calibri" w:eastAsia="微软雅黑"/>
+          <w:b/>
+          <w:color w:val="242820"/>
+          <w:sz w:val="28"/>
+        </w:rPr>
+        <w:t>3.4 数据模型设计</w:t>
+      </w:r>
+    </w:p>
+    <w:p>
+      <w:pPr>
+        <w:spacing w:after="120"/>
+      </w:pPr>
+      <w:r>
+        <w:rPr>
+          <w:rFonts w:ascii="Calibri" w:hAnsi="Calibri" w:eastAsia="微软雅黑"/>
+          <w:b w:val="0"/>
+          <w:color w:val="242820"/>
+          <w:sz w:val="21"/>
+        </w:rPr>
+        <w:t>三类数据分别持久化到本地 JSON 文件，结构简洁、可直接阅读与迁移：</w:t>
+      </w:r>
+    </w:p>
+    <w:p>
+      <w:pPr>
+        <w:spacing w:after="160"/>
+        <w:ind w:left="200" w:right="200"/>
+        <w:shd w:val="clear" w:color="auto" w:fill="F2F4EF"/>
+      </w:pPr>
+      <w:r>
+        <w:rPr>
+          <w:rFonts w:ascii="Consolas" w:hAnsi="Consolas" w:eastAsia="微软雅黑"/>
+          <w:color w:val="333830"/>
+          <w:sz w:val="18"/>
+        </w:rPr>
+        <w:t>history.json        # 学习历史</w:t>
+        <w:br/>
+      </w:r>
+      <w:r>
+        <w:rPr>
+          <w:rFonts w:ascii="Consolas" w:hAnsi="Consolas" w:eastAsia="微软雅黑"/>
+          <w:color w:val="333830"/>
+          <w:sz w:val="18"/>
+        </w:rPr>
+        <w:t>[{ "mode": "语法改错", "text": "...",</w:t>
+        <w:br/>
+      </w:r>
+      <w:r>
+        <w:rPr>
+          <w:rFonts w:ascii="Consolas" w:hAnsi="Consolas" w:eastAsia="微软雅黑"/>
+          <w:color w:val="333830"/>
+          <w:sz w:val="18"/>
+        </w:rPr>
+        <w:t xml:space="preserve">   "answer": "...", "created_at": "2026-10-27 22:00" }]</w:t>
+        <w:br/>
+      </w:r>
+      <w:r>
+        <w:rPr>
+          <w:rFonts w:ascii="Consolas" w:hAnsi="Consolas" w:eastAsia="微软雅黑"/>
+          <w:color w:val="333830"/>
+          <w:sz w:val="18"/>
+        </w:rPr>
+        <w:br/>
+      </w:r>
+      <w:r>
+        <w:rPr>
+          <w:rFonts w:ascii="Consolas" w:hAnsi="Consolas" w:eastAsia="微软雅黑"/>
+          <w:color w:val="333830"/>
+          <w:sz w:val="18"/>
+        </w:rPr>
+        <w:t>wrongbook.json      # 错题本</w:t>
+        <w:br/>
+      </w:r>
+      <w:r>
+        <w:rPr>
+          <w:rFonts w:ascii="Consolas" w:hAnsi="Consolas" w:eastAsia="微软雅黑"/>
+          <w:color w:val="333830"/>
+          <w:sz w:val="18"/>
+        </w:rPr>
+        <w:t>[{ "question": "...", "topic": "...",</w:t>
+        <w:br/>
+      </w:r>
+      <w:r>
+        <w:rPr>
+          <w:rFonts w:ascii="Consolas" w:hAnsi="Consolas" w:eastAsia="微软雅黑"/>
+          <w:color w:val="333830"/>
+          <w:sz w:val="18"/>
+        </w:rPr>
+        <w:t xml:space="preserve">   "user_answer": "...", "created_at": "..." }]</w:t>
+        <w:br/>
+      </w:r>
+      <w:r>
+        <w:rPr>
+          <w:rFonts w:ascii="Consolas" w:hAnsi="Consolas" w:eastAsia="微软雅黑"/>
+          <w:color w:val="333830"/>
+          <w:sz w:val="18"/>
+        </w:rPr>
+        <w:br/>
+      </w:r>
+      <w:r>
+        <w:rPr>
+          <w:rFonts w:ascii="Consolas" w:hAnsi="Consolas" w:eastAsia="微软雅黑"/>
+          <w:color w:val="333830"/>
+          <w:sz w:val="18"/>
+        </w:rPr>
+        <w:t>chat_history.json   # 对话记录</w:t>
+        <w:br/>
+      </w:r>
+      <w:r>
+        <w:rPr>
+          <w:rFonts w:ascii="Consolas" w:hAnsi="Consolas" w:eastAsia="微软雅黑"/>
+          <w:color w:val="333830"/>
+          <w:sz w:val="18"/>
+        </w:rPr>
+        <w:t>[{ "role": "user", "content": "..." },</w:t>
+        <w:br/>
+      </w:r>
+      <w:r>
+        <w:rPr>
+          <w:rFonts w:ascii="Consolas" w:hAnsi="Consolas" w:eastAsia="微软雅黑"/>
+          <w:color w:val="333830"/>
+          <w:sz w:val="18"/>
+        </w:rPr>
+        <w:t xml:space="preserve"> { "role": "assistant", "content": "..." }]</w:t>
       </w:r>
     </w:p>
     <w:p>
@@ -2397,6 +3405,326 @@
           <w:sz w:val="18"/>
         </w:rPr>
         <w:t xml:space="preserve">    )</w:t>
+      </w:r>
+    </w:p>
+    <w:p>
+      <w:pPr>
+        <w:spacing w:before="240" w:after="100"/>
+      </w:pPr>
+      <w:r>
+        <w:rPr>
+          <w:rFonts w:ascii="Calibri" w:hAnsi="Calibri" w:eastAsia="微软雅黑"/>
+          <w:b/>
+          <w:color w:val="242820"/>
+          <w:sz w:val="28"/>
+        </w:rPr>
+        <w:t>4.8 原创头像生成</w:t>
+      </w:r>
+    </w:p>
+    <w:p>
+      <w:pPr>
+        <w:spacing w:after="120"/>
+      </w:pPr>
+      <w:r>
+        <w:rPr>
+          <w:rFonts w:ascii="Calibri" w:hAnsi="Calibri" w:eastAsia="微软雅黑"/>
+          <w:b w:val="0"/>
+          <w:color w:val="242820"/>
+          <w:sz w:val="21"/>
+        </w:rPr>
+        <w:t>AI 头像支持两种方式：默认使用 PIL 程序化绘制一个原创的猫娘头像（零依赖、离线可用）；用户也可通过阿里云百炼「通义万相」生成自定义二次元形象（异步任务 + 轮询下载）。</w:t>
+      </w:r>
+    </w:p>
+    <w:p>
+      <w:pPr>
+        <w:spacing w:after="160"/>
+        <w:ind w:left="200" w:right="200"/>
+        <w:shd w:val="clear" w:color="auto" w:fill="F2F4EF"/>
+      </w:pPr>
+      <w:r>
+        <w:rPr>
+          <w:rFonts w:ascii="Consolas" w:hAnsi="Consolas" w:eastAsia="微软雅黑"/>
+          <w:color w:val="333830"/>
+          <w:sz w:val="18"/>
+        </w:rPr>
+        <w:t>def create_default_catgirl_avatar():</w:t>
+        <w:br/>
+      </w:r>
+      <w:r>
+        <w:rPr>
+          <w:rFonts w:ascii="Consolas" w:hAnsi="Consolas" w:eastAsia="微软雅黑"/>
+          <w:color w:val="333830"/>
+          <w:sz w:val="18"/>
+        </w:rPr>
+        <w:t xml:space="preserve">    image = Image.new("RGB", (256, 256))</w:t>
+        <w:br/>
+      </w:r>
+      <w:r>
+        <w:rPr>
+          <w:rFonts w:ascii="Consolas" w:hAnsi="Consolas" w:eastAsia="微软雅黑"/>
+          <w:color w:val="333830"/>
+          <w:sz w:val="18"/>
+        </w:rPr>
+        <w:t xml:space="preserve">    draw = ImageDraw.Draw(image)</w:t>
+        <w:br/>
+      </w:r>
+      <w:r>
+        <w:rPr>
+          <w:rFonts w:ascii="Consolas" w:hAnsi="Consolas" w:eastAsia="微软雅黑"/>
+          <w:color w:val="333830"/>
+          <w:sz w:val="18"/>
+        </w:rPr>
+        <w:t xml:space="preserve">    draw.polygon(...)    # 猫耳</w:t>
+        <w:br/>
+      </w:r>
+      <w:r>
+        <w:rPr>
+          <w:rFonts w:ascii="Consolas" w:hAnsi="Consolas" w:eastAsia="微软雅黑"/>
+          <w:color w:val="333830"/>
+          <w:sz w:val="18"/>
+        </w:rPr>
+        <w:t xml:space="preserve">    draw.ellipse(...)    # 脸型、头发</w:t>
+        <w:br/>
+      </w:r>
+      <w:r>
+        <w:rPr>
+          <w:rFonts w:ascii="Consolas" w:hAnsi="Consolas" w:eastAsia="微软雅黑"/>
+          <w:color w:val="333830"/>
+          <w:sz w:val="18"/>
+        </w:rPr>
+        <w:t xml:space="preserve">    draw.ellipse(...)    # 眼睛、腮红、微笑</w:t>
+        <w:br/>
+      </w:r>
+      <w:r>
+        <w:rPr>
+          <w:rFonts w:ascii="Consolas" w:hAnsi="Consolas" w:eastAsia="微软雅黑"/>
+          <w:color w:val="333830"/>
+          <w:sz w:val="18"/>
+        </w:rPr>
+        <w:t xml:space="preserve">    return image</w:t>
+      </w:r>
+    </w:p>
+    <w:p>
+      <w:pPr>
+        <w:spacing w:before="240" w:after="100"/>
+      </w:pPr>
+      <w:r>
+        <w:rPr>
+          <w:rFonts w:ascii="Calibri" w:hAnsi="Calibri" w:eastAsia="微软雅黑"/>
+          <w:b/>
+          <w:color w:val="242820"/>
+          <w:sz w:val="28"/>
+        </w:rPr>
+        <w:t>4.9 语音输入</w:t>
+      </w:r>
+    </w:p>
+    <w:p>
+      <w:pPr>
+        <w:spacing w:after="120"/>
+      </w:pPr>
+      <w:r>
+        <w:rPr>
+          <w:rFonts w:ascii="Calibri" w:hAnsi="Calibri" w:eastAsia="微软雅黑"/>
+          <w:b w:val="0"/>
+          <w:color w:val="242820"/>
+          <w:sz w:val="21"/>
+        </w:rPr>
+        <w:t>语音输入采用「浏览器录音 → Azure Speech 识别 → 文本回填」的流程：识别结果先回填到输入框，用户可编辑后再发送；未配置 Azure 服务或 SDK 时自动降级为纯文字输入，不影响核心功能。</w:t>
+      </w:r>
+    </w:p>
+    <w:p>
+      <w:pPr>
+        <w:spacing w:after="160"/>
+        <w:ind w:left="200" w:right="200"/>
+        <w:shd w:val="clear" w:color="auto" w:fill="F2F4EF"/>
+      </w:pPr>
+      <w:r>
+        <w:rPr>
+          <w:rFonts w:ascii="Consolas" w:hAnsi="Consolas" w:eastAsia="微软雅黑"/>
+          <w:color w:val="333830"/>
+          <w:sz w:val="18"/>
+        </w:rPr>
+        <w:t>audio = mic_recorder(format="wav", ...)</w:t>
+        <w:br/>
+      </w:r>
+      <w:r>
+        <w:rPr>
+          <w:rFonts w:ascii="Consolas" w:hAnsi="Consolas" w:eastAsia="微软雅黑"/>
+          <w:color w:val="333830"/>
+          <w:sz w:val="18"/>
+        </w:rPr>
+        <w:t>text = transcribe_with_azure(audio["bytes"],</w:t>
+        <w:br/>
+      </w:r>
+      <w:r>
+        <w:rPr>
+          <w:rFonts w:ascii="Consolas" w:hAnsi="Consolas" w:eastAsia="微软雅黑"/>
+          <w:color w:val="333830"/>
+          <w:sz w:val="18"/>
+        </w:rPr>
+        <w:t xml:space="preserve">        language=voice_language, subscription_key=..., region=...)</w:t>
+      </w:r>
+    </w:p>
+    <w:p>
+      <w:pPr>
+        <w:spacing w:before="240" w:after="100"/>
+      </w:pPr>
+      <w:r>
+        <w:rPr>
+          <w:rFonts w:ascii="Calibri" w:hAnsi="Calibri" w:eastAsia="微软雅黑"/>
+          <w:b/>
+          <w:color w:val="242820"/>
+          <w:sz w:val="28"/>
+        </w:rPr>
+        <w:t>4.10 界面视觉与动效设计</w:t>
+      </w:r>
+    </w:p>
+    <w:p>
+      <w:pPr>
+        <w:spacing w:after="120"/>
+      </w:pPr>
+      <w:r>
+        <w:rPr>
+          <w:rFonts w:ascii="Calibri" w:hAnsi="Calibri" w:eastAsia="微软雅黑"/>
+          <w:b w:val="0"/>
+          <w:color w:val="242820"/>
+          <w:sz w:val="21"/>
+        </w:rPr>
+        <w:t>界面采用「Daylight」设计语言——高对比度、柔和渐变背景、苹果风标题栏、卡片式布局，并通过 CSS 动画（淡入、上浮、弹簧缓动）提升质感：</w:t>
+      </w:r>
+    </w:p>
+    <w:p>
+      <w:pPr>
+        <w:pStyle w:val="ListBullet"/>
+        <w:spacing w:after="60"/>
+        <w:ind w:left="360"/>
+      </w:pPr>
+      <w:r>
+        <w:rPr>
+          <w:rFonts w:ascii="Calibri" w:hAnsi="Calibri" w:eastAsia="微软雅黑"/>
+          <w:color w:val="242820"/>
+          <w:sz w:val="21"/>
+        </w:rPr>
+        <w:t>苹果红绿灯标题栏：红黄绿三个圆点 + 已打开界面栈提示。</w:t>
+      </w:r>
+    </w:p>
+    <w:p>
+      <w:pPr>
+        <w:pStyle w:val="ListBullet"/>
+        <w:spacing w:after="60"/>
+        <w:ind w:left="360"/>
+      </w:pPr>
+      <w:r>
+        <w:rPr>
+          <w:rFonts w:ascii="Calibri" w:hAnsi="Calibri" w:eastAsia="微软雅黑"/>
+          <w:color w:val="242820"/>
+          <w:sz w:val="21"/>
+        </w:rPr>
+        <w:t>卡片式指标卡：悬浮时上浮 + 阴影加深。</w:t>
+      </w:r>
+    </w:p>
+    <w:p>
+      <w:pPr>
+        <w:pStyle w:val="ListBullet"/>
+        <w:spacing w:after="60"/>
+        <w:ind w:left="360"/>
+      </w:pPr>
+      <w:r>
+        <w:rPr>
+          <w:rFonts w:ascii="Calibri" w:hAnsi="Calibri" w:eastAsia="微软雅黑"/>
+          <w:color w:val="242820"/>
+          <w:sz w:val="21"/>
+        </w:rPr>
+        <w:t>毛玻璃侧边栏：背景模糊 + 饱和度提升。</w:t>
+      </w:r>
+    </w:p>
+    <w:p>
+      <w:pPr>
+        <w:pStyle w:val="ListBullet"/>
+        <w:spacing w:after="60"/>
+        <w:ind w:left="360"/>
+      </w:pPr>
+      <w:r>
+        <w:rPr>
+          <w:rFonts w:ascii="Calibri" w:hAnsi="Calibri" w:eastAsia="微软雅黑"/>
+          <w:color w:val="242820"/>
+          <w:sz w:val="21"/>
+        </w:rPr>
+        <w:t>无障碍降级：prefers-reduced-motion 时关闭动画。</w:t>
+      </w:r>
+    </w:p>
+    <w:p>
+      <w:pPr>
+        <w:spacing w:before="240" w:after="100"/>
+      </w:pPr>
+      <w:r>
+        <w:rPr>
+          <w:rFonts w:ascii="Calibri" w:hAnsi="Calibri" w:eastAsia="微软雅黑"/>
+          <w:b/>
+          <w:color w:val="242820"/>
+          <w:sz w:val="28"/>
+        </w:rPr>
+        <w:t>4.11 性能与体验优化</w:t>
+      </w:r>
+    </w:p>
+    <w:p>
+      <w:pPr>
+        <w:pStyle w:val="ListBullet"/>
+        <w:spacing w:after="60"/>
+        <w:ind w:left="360"/>
+      </w:pPr>
+      <w:r>
+        <w:rPr>
+          <w:rFonts w:ascii="Calibri" w:hAnsi="Calibri" w:eastAsia="微软雅黑"/>
+          <w:color w:val="242820"/>
+          <w:sz w:val="21"/>
+        </w:rPr>
+        <w:t>@st.cache_resource 缓存 OpenAI 客户端，避免每次点击重复建连。</w:t>
+      </w:r>
+    </w:p>
+    <w:p>
+      <w:pPr>
+        <w:pStyle w:val="ListBullet"/>
+        <w:spacing w:after="60"/>
+        <w:ind w:left="360"/>
+      </w:pPr>
+      <w:r>
+        <w:rPr>
+          <w:rFonts w:ascii="Calibri" w:hAnsi="Calibri" w:eastAsia="微软雅黑"/>
+          <w:color w:val="242820"/>
+          <w:sz w:val="21"/>
+        </w:rPr>
+        <w:t>流式输出，首字延迟低，体验接近实时对话。</w:t>
+      </w:r>
+    </w:p>
+    <w:p>
+      <w:pPr>
+        <w:pStyle w:val="ListBullet"/>
+        <w:spacing w:after="60"/>
+        <w:ind w:left="360"/>
+      </w:pPr>
+      <w:r>
+        <w:rPr>
+          <w:rFonts w:ascii="Calibri" w:hAnsi="Calibri" w:eastAsia="微软雅黑"/>
+          <w:color w:val="242820"/>
+          <w:sz w:val="21"/>
+        </w:rPr>
+        <w:t>双重超时保护：单次请求超时 + 流式总时长上限。</w:t>
+      </w:r>
+    </w:p>
+    <w:p>
+      <w:pPr>
+        <w:pStyle w:val="ListBullet"/>
+        <w:spacing w:after="60"/>
+        <w:ind w:left="360"/>
+      </w:pPr>
+      <w:r>
+        <w:rPr>
+          <w:rFonts w:ascii="Calibri" w:hAnsi="Calibri" w:eastAsia="微软雅黑"/>
+          <w:color w:val="242820"/>
+          <w:sz w:val="21"/>
+        </w:rPr>
+        <w:t>历史记录只保留最近 N 条，控制内存占用与请求体积。</w:t>
       </w:r>
     </w:p>
     <w:p>
@@ -3579,6 +4907,174 @@
         <w:t>探索在线部署（Streamlit Community Cloud），降低使用门槛。</w:t>
       </w:r>
     </w:p>
+    <w:p>
+      <w:pPr>
+        <w:spacing w:before="360" w:after="160"/>
+        <w:pBdr>
+          <w:bottom w:val="single" w:sz="6" w:space="3" w:color="A7BD97"/>
+        </w:pBdr>
+      </w:pPr>
+      <w:r>
+        <w:rPr>
+          <w:rFonts w:ascii="Calibri" w:hAnsi="Calibri" w:eastAsia="微软雅黑"/>
+          <w:b/>
+          <w:color w:val="506744"/>
+          <w:sz w:val="34"/>
+        </w:rPr>
+        <w:t>十、典型使用场景</w:t>
+      </w:r>
+    </w:p>
+    <w:p>
+      <w:pPr>
+        <w:spacing w:after="120"/>
+      </w:pPr>
+      <w:r>
+        <w:rPr>
+          <w:rFonts w:ascii="Calibri" w:hAnsi="Calibri" w:eastAsia="微软雅黑"/>
+          <w:b w:val="0"/>
+          <w:color w:val="242820"/>
+          <w:sz w:val="21"/>
+        </w:rPr>
+        <w:t>以一个备考四级的学生「一天」为例，展示应用如何贯穿学习与情绪陪伴的全过程：</w:t>
+      </w:r>
+    </w:p>
+    <w:p>
+      <w:pPr>
+        <w:pStyle w:val="ListBullet"/>
+        <w:spacing w:after="60"/>
+        <w:ind w:left="360"/>
+      </w:pPr>
+      <w:r>
+        <w:rPr>
+          <w:rFonts w:ascii="Calibri" w:hAnsi="Calibri" w:eastAsia="微软雅黑"/>
+          <w:color w:val="242820"/>
+          <w:sz w:val="21"/>
+        </w:rPr>
+        <w:t>早上：在 AI 对话里用简单英语闲聊几句，AI 根据情绪自动切换语气，轻松开口。</w:t>
+      </w:r>
+    </w:p>
+    <w:p>
+      <w:pPr>
+        <w:pStyle w:val="ListBullet"/>
+        <w:spacing w:after="60"/>
+        <w:ind w:left="360"/>
+      </w:pPr>
+      <w:r>
+        <w:rPr>
+          <w:rFonts w:ascii="Calibri" w:hAnsi="Calibri" w:eastAsia="微软雅黑"/>
+          <w:color w:val="242820"/>
+          <w:sz w:val="21"/>
+        </w:rPr>
+        <w:t>白天：在英语助手改错一句英文，并针对错误一键生成题目巩固。</w:t>
+      </w:r>
+    </w:p>
+    <w:p>
+      <w:pPr>
+        <w:pStyle w:val="ListBullet"/>
+        <w:spacing w:after="60"/>
+        <w:ind w:left="360"/>
+      </w:pPr>
+      <w:r>
+        <w:rPr>
+          <w:rFonts w:ascii="Calibri" w:hAnsi="Calibri" w:eastAsia="微软雅黑"/>
+          <w:color w:val="242820"/>
+          <w:sz w:val="21"/>
+        </w:rPr>
+        <w:t>晚上：在做题本练习，错题自动进入错题本，重做后攻克移除。</w:t>
+      </w:r>
+    </w:p>
+    <w:p>
+      <w:pPr>
+        <w:pStyle w:val="ListBullet"/>
+        <w:spacing w:after="60"/>
+        <w:ind w:left="360"/>
+      </w:pPr>
+      <w:r>
+        <w:rPr>
+          <w:rFonts w:ascii="Calibri" w:hAnsi="Calibri" w:eastAsia="微软雅黑"/>
+          <w:color w:val="242820"/>
+          <w:sz w:val="21"/>
+        </w:rPr>
+        <w:t>睡前：打开历史记录回顾成长数字，学习日历看到坚持天数与四级倒计时。</w:t>
+      </w:r>
+    </w:p>
+    <w:p>
+      <w:pPr>
+        <w:spacing w:before="360" w:after="160"/>
+        <w:pBdr>
+          <w:bottom w:val="single" w:sz="6" w:space="3" w:color="A7BD97"/>
+        </w:pBdr>
+      </w:pPr>
+      <w:r>
+        <w:rPr>
+          <w:rFonts w:ascii="Calibri" w:hAnsi="Calibri" w:eastAsia="微软雅黑"/>
+          <w:b/>
+          <w:color w:val="506744"/>
+          <w:sz w:val="34"/>
+        </w:rPr>
+        <w:t>十一、安全与隐私设计</w:t>
+      </w:r>
+    </w:p>
+    <w:p>
+      <w:pPr>
+        <w:pStyle w:val="ListBullet"/>
+        <w:spacing w:after="60"/>
+        <w:ind w:left="360"/>
+      </w:pPr>
+      <w:r>
+        <w:rPr>
+          <w:rFonts w:ascii="Calibri" w:hAnsi="Calibri" w:eastAsia="微软雅黑"/>
+          <w:color w:val="242820"/>
+          <w:sz w:val="21"/>
+        </w:rPr>
+        <w:t>API Key 不硬编码：仅存于 session 内存，不持久化，关闭即失效。</w:t>
+      </w:r>
+    </w:p>
+    <w:p>
+      <w:pPr>
+        <w:pStyle w:val="ListBullet"/>
+        <w:spacing w:after="60"/>
+        <w:ind w:left="360"/>
+      </w:pPr>
+      <w:r>
+        <w:rPr>
+          <w:rFonts w:ascii="Calibri" w:hAnsi="Calibri" w:eastAsia="微软雅黑"/>
+          <w:color w:val="242820"/>
+          <w:sz w:val="21"/>
+        </w:rPr>
+        <w:t>隐私数据隔离：history / wrongbook / chat 三类 JSON 均通过 .gitignore 排除。</w:t>
+      </w:r>
+    </w:p>
+    <w:p>
+      <w:pPr>
+        <w:pStyle w:val="ListBullet"/>
+        <w:spacing w:after="60"/>
+        <w:ind w:left="360"/>
+      </w:pPr>
+      <w:r>
+        <w:rPr>
+          <w:rFonts w:ascii="Calibri" w:hAnsi="Calibri" w:eastAsia="微软雅黑"/>
+          <w:color w:val="242820"/>
+          <w:sz w:val="21"/>
+        </w:rPr>
+        <w:t>密钥文件保护：.streamlit/secrets.toml 同样被排除在版本库之外。</w:t>
+      </w:r>
+    </w:p>
+    <w:p>
+      <w:pPr>
+        <w:pStyle w:val="ListBullet"/>
+        <w:spacing w:after="60"/>
+        <w:ind w:left="360"/>
+      </w:pPr>
+      <w:r>
+        <w:rPr>
+          <w:rFonts w:ascii="Calibri" w:hAnsi="Calibri" w:eastAsia="微软雅黑"/>
+          <w:color w:val="242820"/>
+          <w:sz w:val="21"/>
+        </w:rPr>
+        <w:t>外部服务可选：语音、图像生成等均需用户主动配置 Key，未配置时优雅降级。</w:t>
+      </w:r>
+    </w:p>
     <w:sectPr>
       <w:pgSz w:w="12240" w:h="15840"/>
       <w:pgMar w:top="1152" w:right="1296" w:bottom="1152" w:left="1296" w:header="720" w:footer="720" w:gutter="0"/>

</xml_diff>